<commit_message>
checking from mrvijaysgithub 4
</commit_message>
<xml_diff>
--- a/Microsoft_Learn/Azure Fundamentals.docx
+++ b/Microsoft_Learn/Azure Fundamentals.docx
@@ -1981,9 +1981,6 @@
       <w:r>
         <w:t>by Microsoft Azure and will learn more about the governance and compliance services that you can use.</w:t>
       </w:r>
-      <w:r>
-        <w:t xml:space="preserve"> </w:t>
-      </w:r>
     </w:p>
     <w:p>
       <w:pPr>
@@ -2522,6 +2519,7 @@
     </w:p>
     <w:p>
       <w:r>
+        <w:lastRenderedPageBreak/>
         <w:t xml:space="preserve">Because </w:t>
       </w:r>
       <w:r>
@@ -2997,7 +2995,14 @@
         <w:rPr>
           <w:highlight w:val="green"/>
         </w:rPr>
-        <w:t>ddle ground between IaaS and SaaS,</w:t>
+        <w:t xml:space="preserve">ddle ground between </w:t>
+      </w:r>
+      <w:r>
+        <w:rPr>
+          <w:highlight w:val="green"/>
+        </w:rPr>
+        <w:lastRenderedPageBreak/>
+        <w:t>IaaS and SaaS,</w:t>
       </w:r>
       <w:r>
         <w:t xml:space="preserve"> rests somewhere in the middle and evenly distributes responsibility between the cloud provider and the consumer.</w:t>
@@ -3592,6 +3597,7 @@
         <w:rPr>
           <w:highlight w:val="yellow"/>
         </w:rPr>
+        <w:lastRenderedPageBreak/>
         <w:t>Network</w:t>
       </w:r>
       <w:r>
@@ -3978,6 +3984,7 @@
                 <w:b/>
                 <w:bCs/>
               </w:rPr>
+              <w:lastRenderedPageBreak/>
               <w:t>Public cloud</w:t>
             </w:r>
           </w:p>
@@ -4459,143 +4466,82 @@
         <w:rPr>
           <w:highlight w:val="yellow"/>
         </w:rPr>
-        <w:t>Capital expenditure (</w:t>
-      </w:r>
-      <w:proofErr w:type="spellStart"/>
-      <w:r>
-        <w:rPr>
-          <w:highlight w:val="yellow"/>
+        <w:t>Capital expenditure (CapEx) and operational expenditure (OpEx).</w:t>
+      </w:r>
+    </w:p>
+    <w:p>
+      <w:r>
+        <w:rPr>
+          <w:highlight w:val="red"/>
         </w:rPr>
         <w:t>CapEx</w:t>
       </w:r>
-      <w:proofErr w:type="spellEnd"/>
-      <w:r>
-        <w:rPr>
-          <w:highlight w:val="yellow"/>
-        </w:rPr>
-        <w:t>) and operational expenditure (</w:t>
-      </w:r>
-      <w:proofErr w:type="spellStart"/>
-      <w:r>
-        <w:rPr>
-          <w:highlight w:val="yellow"/>
+      <w:r>
+        <w:t xml:space="preserve"> is typically a </w:t>
+      </w:r>
+      <w:r>
+        <w:rPr>
+          <w:highlight w:val="green"/>
+        </w:rPr>
+        <w:t>one-time, up-front expenditure</w:t>
+      </w:r>
+      <w:r>
+        <w:t xml:space="preserve"> to purchase or secure tangible resources. A </w:t>
+      </w:r>
+      <w:r>
+        <w:rPr>
+          <w:color w:val="0070C0"/>
+        </w:rPr>
+        <w:t>new building, repaving the parking lot, building a datacenter, or buying a company vehicle are examples of CapEx</w:t>
+      </w:r>
+      <w:r>
+        <w:t>.</w:t>
+      </w:r>
+    </w:p>
+    <w:p>
+      <w:r>
+        <w:lastRenderedPageBreak/>
+        <w:t xml:space="preserve">In contrast, </w:t>
+      </w:r>
+      <w:r>
+        <w:rPr>
+          <w:highlight w:val="red"/>
         </w:rPr>
         <w:t>OpEx</w:t>
       </w:r>
-      <w:proofErr w:type="spellEnd"/>
-      <w:r>
-        <w:rPr>
-          <w:highlight w:val="yellow"/>
-        </w:rPr>
-        <w:t>).</w:t>
-      </w:r>
-    </w:p>
-    <w:p>
-      <w:proofErr w:type="spellStart"/>
-      <w:r>
-        <w:rPr>
-          <w:highlight w:val="red"/>
-        </w:rPr>
-        <w:t>CapEx</w:t>
-      </w:r>
-      <w:proofErr w:type="spellEnd"/>
-      <w:r>
-        <w:t xml:space="preserve"> is typically a </w:t>
+      <w:r>
+        <w:t xml:space="preserve"> is </w:t>
       </w:r>
       <w:r>
         <w:rPr>
           <w:highlight w:val="green"/>
         </w:rPr>
-        <w:t>one-time, up-front expenditure</w:t>
-      </w:r>
-      <w:r>
-        <w:t xml:space="preserve"> to purchase or secure tangible resources. A </w:t>
+        <w:t>spending money on services or products over time</w:t>
+      </w:r>
+      <w:r>
+        <w:t xml:space="preserve">. </w:t>
       </w:r>
       <w:r>
         <w:rPr>
           <w:color w:val="0070C0"/>
         </w:rPr>
-        <w:t xml:space="preserve">new building, repaving the parking lot, building a datacenter, or buying a company vehicle are examples of </w:t>
-      </w:r>
-      <w:proofErr w:type="spellStart"/>
-      <w:r>
+        <w:t>Renting a convention center, leasing a company vehicle, or signing up for cloud services</w:t>
+      </w:r>
+      <w:r>
+        <w:t xml:space="preserve"> are all examples of OpEx.</w:t>
+      </w:r>
+    </w:p>
+    <w:p>
+      <w:pPr>
         <w:rPr>
           <w:color w:val="0070C0"/>
         </w:rPr>
-        <w:t>CapEx</w:t>
-      </w:r>
-      <w:proofErr w:type="spellEnd"/>
-      <w:r>
-        <w:t>.</w:t>
-      </w:r>
-    </w:p>
-    <w:p>
-      <w:r>
-        <w:t xml:space="preserve">In contrast, </w:t>
-      </w:r>
-      <w:proofErr w:type="spellStart"/>
-      <w:r>
-        <w:rPr>
-          <w:highlight w:val="red"/>
-        </w:rPr>
-        <w:t>OpEx</w:t>
-      </w:r>
-      <w:proofErr w:type="spellEnd"/>
-      <w:r>
-        <w:t xml:space="preserve"> is </w:t>
-      </w:r>
-      <w:r>
-        <w:rPr>
-          <w:highlight w:val="green"/>
-        </w:rPr>
-        <w:t>spending money on services or products over time</w:t>
-      </w:r>
-      <w:r>
-        <w:t xml:space="preserve">. </w:t>
-      </w:r>
-      <w:r>
-        <w:rPr>
-          <w:color w:val="0070C0"/>
-        </w:rPr>
-        <w:t>Renting a convention center, leasing a company vehicle, or signing up for cloud services</w:t>
-      </w:r>
-      <w:r>
-        <w:t xml:space="preserve"> are all examples of </w:t>
-      </w:r>
-      <w:proofErr w:type="spellStart"/>
-      <w:r>
-        <w:t>OpEx</w:t>
-      </w:r>
-      <w:proofErr w:type="spellEnd"/>
-      <w:r>
-        <w:t>.</w:t>
-      </w:r>
-    </w:p>
-    <w:p>
-      <w:pPr>
-        <w:rPr>
-          <w:color w:val="0070C0"/>
-        </w:rPr>
-      </w:pPr>
-      <w:r>
-        <w:rPr>
-          <w:highlight w:val="yellow"/>
-        </w:rPr>
-        <w:t xml:space="preserve">Cloud computing falls under </w:t>
-      </w:r>
-      <w:proofErr w:type="spellStart"/>
-      <w:r>
-        <w:rPr>
-          <w:highlight w:val="yellow"/>
-        </w:rPr>
-        <w:t>OpEx</w:t>
-      </w:r>
-      <w:proofErr w:type="spellEnd"/>
-      <w:r>
-        <w:rPr>
-          <w:highlight w:val="yellow"/>
-        </w:rPr>
-        <w:t xml:space="preserve"> because</w:t>
+      </w:pPr>
+      <w:r>
+        <w:rPr>
+          <w:highlight w:val="yellow"/>
+        </w:rPr>
+        <w:t>Cloud computing falls under OpEx because</w:t>
       </w:r>
       <w:r>
         <w:t xml:space="preserve"> cloud computing </w:t>
@@ -5019,6 +4965,7 @@
         <w:rPr>
           <w:color w:val="0070C0"/>
         </w:rPr>
+        <w:lastRenderedPageBreak/>
         <w:t xml:space="preserve">Scale as your business needs </w:t>
       </w:r>
       <w:r>
@@ -5454,6 +5401,7 @@
       </w:pPr>
       <w:bookmarkStart w:id="33" w:name="_Toc180007211"/>
       <w:r>
+        <w:lastRenderedPageBreak/>
         <w:t>Describe the benefits of using cloud services</w:t>
       </w:r>
       <w:bookmarkEnd w:id="33"/>
@@ -5817,7 +5765,14 @@
         <w:rPr>
           <w:color w:val="0070C0"/>
         </w:rPr>
-        <w:t>suddenly experience peak traffic and your systems are overwhelmed</w:t>
+        <w:t xml:space="preserve">suddenly experience peak </w:t>
+      </w:r>
+      <w:r>
+        <w:rPr>
+          <w:color w:val="0070C0"/>
+        </w:rPr>
+        <w:lastRenderedPageBreak/>
+        <w:t>traffic and your systems are overwhelmed</w:t>
       </w:r>
       <w:r>
         <w:t xml:space="preserve">, the ability to scale means you </w:t>
@@ -6178,7 +6133,11 @@
         <w:t>your cloud environment itself will automatically shift to a different region for you</w:t>
       </w:r>
       <w:r>
-        <w:t>, with no action needed on your part. You’ll learn more about how Azure leverages global scale to provide reliability later in this series.</w:t>
+        <w:t xml:space="preserve">, with no action </w:t>
+      </w:r>
+      <w:r>
+        <w:lastRenderedPageBreak/>
+        <w:t>needed on your part. You’ll learn more about how Azure leverages global scale to provide reliability later in this series.</w:t>
       </w:r>
     </w:p>
     <w:p>
@@ -6557,6 +6516,7 @@
     </w:p>
     <w:p>
       <w:r>
+        <w:lastRenderedPageBreak/>
         <w:t xml:space="preserve">On the security side, </w:t>
       </w:r>
       <w:r>
@@ -7113,6 +7073,7 @@
         <w:rPr>
           <w:rFonts w:eastAsiaTheme="minorHAnsi"/>
         </w:rPr>
+        <w:lastRenderedPageBreak/>
         <w:t>Describe cloud service types</w:t>
       </w:r>
       <w:bookmarkEnd w:id="41"/>
@@ -7306,7 +7267,11 @@
         <w:t xml:space="preserve">provides you the maximum amount of control </w:t>
       </w:r>
       <w:r>
-        <w:t xml:space="preserve">for your cloud resources. In an IaaS model, the </w:t>
+        <w:t xml:space="preserve">for your cloud resources. In an IaaS model, </w:t>
+      </w:r>
+      <w:r>
+        <w:lastRenderedPageBreak/>
+        <w:t xml:space="preserve">the </w:t>
       </w:r>
       <w:r>
         <w:rPr>
@@ -7540,7 +7505,11 @@
         <w:t>physical infrastructure and its access to the internet,</w:t>
       </w:r>
       <w:r>
-        <w:t xml:space="preserve"> just like in IaaS. In the PaaS model, the cloud provider will als</w:t>
+        <w:t xml:space="preserve"> just like in IaaS. In the </w:t>
+      </w:r>
+      <w:r>
+        <w:lastRenderedPageBreak/>
+        <w:t>PaaS model, the cloud provider will als</w:t>
       </w:r>
       <w:r>
         <w:rPr>
@@ -7854,6 +7823,7 @@
         <w:pStyle w:val="Heading4"/>
       </w:pPr>
       <w:r>
+        <w:lastRenderedPageBreak/>
         <w:t>Scenarios</w:t>
       </w:r>
     </w:p>
@@ -8058,6 +8028,7 @@
         <w:rPr>
           <w:bCs/>
         </w:rPr>
+        <w:lastRenderedPageBreak/>
         <w:t>Describe Azure architecture and services</w:t>
       </w:r>
     </w:p>
@@ -8356,6 +8327,7 @@
           <w:bCs/>
           <w:highlight w:val="yellow"/>
         </w:rPr>
+        <w:lastRenderedPageBreak/>
         <w:t>Seamlessly unify</w:t>
       </w:r>
       <w:r>
@@ -8646,6 +8618,7 @@
         <w:rPr>
           <w:noProof/>
         </w:rPr>
+        <w:lastRenderedPageBreak/>
         <w:drawing>
           <wp:inline distT="0" distB="0" distL="0" distR="0" wp14:anchorId="14C76C6F" wp14:editId="6FCCADF6">
             <wp:extent cx="5753100" cy="4564380"/>
@@ -8837,6 +8810,7 @@
         </w:numPr>
       </w:pPr>
       <w:r>
+        <w:lastRenderedPageBreak/>
         <w:t xml:space="preserve">A </w:t>
       </w:r>
       <w:r>
@@ -9175,6 +9149,7 @@
     </w:p>
     <w:p>
       <w:r>
+        <w:lastRenderedPageBreak/>
         <w:t xml:space="preserve">If you receive a </w:t>
       </w:r>
       <w:r>
@@ -9360,19 +9335,11 @@
       <w:pPr>
         <w:pStyle w:val="Code"/>
       </w:pPr>
-      <w:proofErr w:type="spellStart"/>
       <w:r>
         <w:rPr>
           <w:highlight w:val="magenta"/>
         </w:rPr>
-        <w:t>az</w:t>
-      </w:r>
-      <w:proofErr w:type="spellEnd"/>
-      <w:r>
-        <w:rPr>
-          <w:highlight w:val="magenta"/>
-        </w:rPr>
-        <w:t xml:space="preserve"> version</w:t>
+        <w:t>az version</w:t>
       </w:r>
     </w:p>
     <w:p>
@@ -9413,6 +9380,7 @@
         <w:pStyle w:val="Tips"/>
       </w:pPr>
       <w:r>
+        <w:lastRenderedPageBreak/>
         <w:t>PowerShell</w:t>
       </w:r>
     </w:p>
@@ -9504,15 +9472,7 @@
         <w:t>You can tell you're in BASH mode by the username displayed</w:t>
       </w:r>
       <w:r>
-        <w:t xml:space="preserve"> on the command line. It will be your </w:t>
-      </w:r>
-      <w:proofErr w:type="spellStart"/>
-      <w:r>
-        <w:t>username@azure</w:t>
-      </w:r>
-      <w:proofErr w:type="spellEnd"/>
-      <w:r>
-        <w:t>.</w:t>
+        <w:t xml:space="preserve"> on the command line. It will be your username@azure.</w:t>
       </w:r>
     </w:p>
     <w:p>
@@ -9658,21 +9618,7 @@
         <w:rPr>
           <w:highlight w:val="yellow"/>
         </w:rPr>
-        <w:t xml:space="preserve">use the letters </w:t>
-      </w:r>
-      <w:proofErr w:type="spellStart"/>
-      <w:r>
-        <w:rPr>
-          <w:highlight w:val="yellow"/>
-        </w:rPr>
-        <w:t>az</w:t>
-      </w:r>
-      <w:proofErr w:type="spellEnd"/>
-      <w:r>
-        <w:rPr>
-          <w:highlight w:val="yellow"/>
-        </w:rPr>
-        <w:t xml:space="preserve"> to start an Azure command</w:t>
+        <w:t>use the letters az to start an Azure command</w:t>
       </w:r>
       <w:r>
         <w:t xml:space="preserve"> in the BASH mode. Try to </w:t>
@@ -9681,21 +9627,7 @@
         <w:rPr>
           <w:highlight w:val="yellow"/>
         </w:rPr>
-        <w:t xml:space="preserve">run an update to the CLI with </w:t>
-      </w:r>
-      <w:proofErr w:type="spellStart"/>
-      <w:r>
-        <w:rPr>
-          <w:highlight w:val="yellow"/>
-        </w:rPr>
-        <w:t>az</w:t>
-      </w:r>
-      <w:proofErr w:type="spellEnd"/>
-      <w:r>
-        <w:rPr>
-          <w:highlight w:val="yellow"/>
-        </w:rPr>
-        <w:t xml:space="preserve"> upgrade</w:t>
+        <w:t>run an update to the CLI with az upgrade</w:t>
       </w:r>
       <w:r>
         <w:t>.</w:t>
@@ -9716,115 +9648,78 @@
           <w:highlight w:val="magenta"/>
         </w:rPr>
       </w:pPr>
-      <w:proofErr w:type="spellStart"/>
       <w:r>
         <w:rPr>
           <w:highlight w:val="magenta"/>
         </w:rPr>
-        <w:t>az</w:t>
-      </w:r>
-      <w:proofErr w:type="spellEnd"/>
-      <w:r>
+        <w:t>az upgrade</w:t>
+      </w:r>
+    </w:p>
+    <w:p>
+      <w:r>
+        <w:t xml:space="preserve">You can </w:t>
+      </w:r>
+      <w:r>
+        <w:rPr>
+          <w:highlight w:val="cyan"/>
+        </w:rPr>
+        <w:t>change back to PowerShell mode by entering pwsh</w:t>
+      </w:r>
+      <w:r>
+        <w:t xml:space="preserve"> on the BASH command line.</w:t>
+      </w:r>
+    </w:p>
+    <w:p>
+      <w:pPr>
+        <w:pStyle w:val="Heading4"/>
+      </w:pPr>
+      <w:r>
+        <w:t>Task 3: Use Azure CLI interactive mode</w:t>
+      </w:r>
+    </w:p>
+    <w:p>
+      <w:r>
+        <w:t xml:space="preserve">Another way to interact is using the Azure CLI interactive mode. This changes CLI behavior </w:t>
+      </w:r>
+      <w:r>
+        <w:rPr>
+          <w:highlight w:val="yellow"/>
+        </w:rPr>
+        <w:t>to more closely resemble an integrated development environment</w:t>
+      </w:r>
+      <w:r>
+        <w:t xml:space="preserve"> (IDE). Interactive mode provides autocompletion, command descriptions, and even examples. If you’re unfamiliar with BASH and PowerShell, but want to use the command line, interactive mode may help you.</w:t>
+      </w:r>
+    </w:p>
+    <w:p>
+      <w:r>
+        <w:rPr>
+          <w:highlight w:val="cyan"/>
+        </w:rPr>
+        <w:lastRenderedPageBreak/>
+        <w:t>Enter az interactive to enter interactive mode.</w:t>
+      </w:r>
+    </w:p>
+    <w:p>
+      <w:pPr>
+        <w:pStyle w:val="Tips"/>
+      </w:pPr>
+      <w:r>
+        <w:t>Azure CLI</w:t>
+      </w:r>
+    </w:p>
+    <w:p>
+      <w:pPr>
+        <w:pStyle w:val="Code"/>
         <w:rPr>
           <w:highlight w:val="magenta"/>
         </w:rPr>
-        <w:t xml:space="preserve"> upgrade</w:t>
-      </w:r>
-    </w:p>
-    <w:p>
-      <w:r>
-        <w:t xml:space="preserve">You can </w:t>
-      </w:r>
-      <w:r>
-        <w:rPr>
-          <w:highlight w:val="cyan"/>
-        </w:rPr>
-        <w:t xml:space="preserve">change back to PowerShell mode by entering </w:t>
-      </w:r>
-      <w:proofErr w:type="spellStart"/>
-      <w:r>
-        <w:rPr>
-          <w:highlight w:val="cyan"/>
-        </w:rPr>
-        <w:t>pwsh</w:t>
-      </w:r>
-      <w:proofErr w:type="spellEnd"/>
-      <w:r>
-        <w:t xml:space="preserve"> on the BASH command line.</w:t>
-      </w:r>
-    </w:p>
-    <w:p>
-      <w:pPr>
-        <w:pStyle w:val="Heading4"/>
-      </w:pPr>
-      <w:r>
-        <w:t>Task 3: Use Azure CLI interactive mode</w:t>
-      </w:r>
-    </w:p>
-    <w:p>
-      <w:r>
-        <w:t xml:space="preserve">Another way to interact is using the Azure CLI interactive mode. This changes CLI behavior </w:t>
-      </w:r>
-      <w:r>
-        <w:rPr>
-          <w:highlight w:val="yellow"/>
-        </w:rPr>
-        <w:t>to more closely resemble an integrated development environment</w:t>
-      </w:r>
-      <w:r>
-        <w:t xml:space="preserve"> (IDE). Interactive mode provides autocompletion, command descriptions, and even examples. If you’re unfamiliar with BASH and PowerShell, but want to use the command line, interactive mode may help you.</w:t>
-      </w:r>
-    </w:p>
-    <w:p>
-      <w:r>
-        <w:rPr>
-          <w:highlight w:val="cyan"/>
-        </w:rPr>
-        <w:t xml:space="preserve">Enter </w:t>
-      </w:r>
-      <w:proofErr w:type="spellStart"/>
-      <w:r>
-        <w:rPr>
-          <w:highlight w:val="cyan"/>
-        </w:rPr>
-        <w:t>az</w:t>
-      </w:r>
-      <w:proofErr w:type="spellEnd"/>
-      <w:r>
-        <w:rPr>
-          <w:highlight w:val="cyan"/>
-        </w:rPr>
-        <w:t xml:space="preserve"> interactive to enter interactive mode.</w:t>
-      </w:r>
-    </w:p>
-    <w:p>
-      <w:pPr>
-        <w:pStyle w:val="Tips"/>
-      </w:pPr>
-      <w:r>
-        <w:t>Azure CLI</w:t>
-      </w:r>
-    </w:p>
-    <w:p>
-      <w:pPr>
-        <w:pStyle w:val="Code"/>
+      </w:pPr>
+      <w:r>
         <w:rPr>
           <w:highlight w:val="magenta"/>
         </w:rPr>
-      </w:pPr>
-      <w:proofErr w:type="spellStart"/>
-      <w:r>
-        <w:rPr>
-          <w:highlight w:val="magenta"/>
-        </w:rPr>
-        <w:t>az</w:t>
-      </w:r>
-      <w:proofErr w:type="spellEnd"/>
-      <w:r>
-        <w:rPr>
-          <w:highlight w:val="magenta"/>
-        </w:rPr>
-        <w:t xml:space="preserve"> interactive</w:t>
+        <w:t>az interactive</w:t>
       </w:r>
     </w:p>
     <w:p>
@@ -9936,32 +9831,68 @@
         <w:rPr>
           <w:highlight w:val="cyan"/>
         </w:rPr>
-        <w:t xml:space="preserve">don't need to enter </w:t>
-      </w:r>
-      <w:proofErr w:type="spellStart"/>
+        <w:t>don't need to enter az to start a command</w:t>
+      </w:r>
+      <w:r>
+        <w:t xml:space="preserve"> (but you can if you want to or are used to it). Try the upgrade or version commands again, but this time without az in front.</w:t>
+      </w:r>
+    </w:p>
+    <w:p>
+      <w:pPr>
+        <w:pStyle w:val="Tips"/>
+      </w:pPr>
+      <w:r>
+        <w:t>Azure CLI</w:t>
+      </w:r>
+    </w:p>
+    <w:p>
+      <w:pPr>
+        <w:pStyle w:val="Code"/>
+        <w:rPr>
+          <w:highlight w:val="magenta"/>
+        </w:rPr>
+      </w:pPr>
+      <w:r>
+        <w:rPr>
+          <w:highlight w:val="magenta"/>
+        </w:rPr>
+        <w:t>version</w:t>
+      </w:r>
+    </w:p>
+    <w:p>
+      <w:pPr>
+        <w:pStyle w:val="Tips"/>
+      </w:pPr>
+      <w:r>
+        <w:t>Azure CLI</w:t>
+      </w:r>
+    </w:p>
+    <w:p>
+      <w:pPr>
+        <w:pStyle w:val="Code"/>
+        <w:rPr>
+          <w:highlight w:val="magenta"/>
+        </w:rPr>
+      </w:pPr>
+      <w:r>
+        <w:rPr>
+          <w:highlight w:val="magenta"/>
+        </w:rPr>
+        <w:t>upgrade</w:t>
+      </w:r>
+    </w:p>
+    <w:p>
+      <w:r>
+        <w:t xml:space="preserve">The commands should have worked the same as before, and given you the same results. Use the </w:t>
+      </w:r>
       <w:r>
         <w:rPr>
           <w:highlight w:val="cyan"/>
         </w:rPr>
-        <w:t>az</w:t>
-      </w:r>
-      <w:proofErr w:type="spellEnd"/>
-      <w:r>
-        <w:rPr>
-          <w:highlight w:val="cyan"/>
-        </w:rPr>
-        <w:t xml:space="preserve"> to start a command</w:t>
-      </w:r>
-      <w:r>
-        <w:t xml:space="preserve"> (but you can if you want to or are used to it). Try the upgrade or version commands again, but this time without </w:t>
-      </w:r>
-      <w:proofErr w:type="spellStart"/>
-      <w:r>
-        <w:t>az</w:t>
-      </w:r>
-      <w:proofErr w:type="spellEnd"/>
-      <w:r>
-        <w:t xml:space="preserve"> in front.</w:t>
+        <w:t>exit command to leave interactive mode</w:t>
+      </w:r>
+      <w:r>
+        <w:t>.</w:t>
       </w:r>
     </w:p>
     <w:p>
@@ -9969,64 +9900,7 @@
         <w:pStyle w:val="Tips"/>
       </w:pPr>
       <w:r>
-        <w:t>Azure CLI</w:t>
-      </w:r>
-    </w:p>
-    <w:p>
-      <w:pPr>
-        <w:pStyle w:val="Code"/>
-        <w:rPr>
-          <w:highlight w:val="magenta"/>
-        </w:rPr>
-      </w:pPr>
-      <w:r>
-        <w:rPr>
-          <w:highlight w:val="magenta"/>
-        </w:rPr>
-        <w:t>version</w:t>
-      </w:r>
-    </w:p>
-    <w:p>
-      <w:pPr>
-        <w:pStyle w:val="Tips"/>
-      </w:pPr>
-      <w:r>
-        <w:t>Azure CLI</w:t>
-      </w:r>
-    </w:p>
-    <w:p>
-      <w:pPr>
-        <w:pStyle w:val="Code"/>
-        <w:rPr>
-          <w:highlight w:val="magenta"/>
-        </w:rPr>
-      </w:pPr>
-      <w:r>
-        <w:rPr>
-          <w:highlight w:val="magenta"/>
-        </w:rPr>
-        <w:t>upgrade</w:t>
-      </w:r>
-    </w:p>
-    <w:p>
-      <w:r>
-        <w:t xml:space="preserve">The commands should have worked the same as before, and given you the same results. Use the </w:t>
-      </w:r>
-      <w:r>
-        <w:rPr>
-          <w:highlight w:val="cyan"/>
-        </w:rPr>
-        <w:t>exit command to leave interactive mode</w:t>
-      </w:r>
-      <w:r>
-        <w:t>.</w:t>
-      </w:r>
-    </w:p>
-    <w:p>
-      <w:pPr>
-        <w:pStyle w:val="Tips"/>
-      </w:pPr>
-      <w:r>
+        <w:lastRenderedPageBreak/>
         <w:t>Azure CLI</w:t>
       </w:r>
     </w:p>
@@ -10336,6 +10210,7 @@
           <w:color w:val="000000" w:themeColor="text1"/>
           <w:highlight w:val="yellow"/>
         </w:rPr>
+        <w:lastRenderedPageBreak/>
         <w:t>Azure intelligently assigns and controls the resources</w:t>
       </w:r>
       <w:r>
@@ -10553,6 +10428,7 @@
         <w:pStyle w:val="Tips"/>
       </w:pPr>
       <w:r>
+        <w:lastRenderedPageBreak/>
         <w:t>Important</w:t>
       </w:r>
     </w:p>
@@ -10891,6 +10767,7 @@
         <w:pStyle w:val="Tips"/>
       </w:pPr>
       <w:r>
+        <w:lastRenderedPageBreak/>
         <w:t>Important</w:t>
       </w:r>
     </w:p>
@@ -11109,7 +10986,14 @@
         <w:rPr>
           <w:highlight w:val="cyan"/>
         </w:rPr>
-        <w:t>some regions</w:t>
+        <w:t xml:space="preserve">some </w:t>
+      </w:r>
+      <w:r>
+        <w:rPr>
+          <w:highlight w:val="cyan"/>
+        </w:rPr>
+        <w:lastRenderedPageBreak/>
+        <w:t>regions</w:t>
       </w:r>
       <w:r>
         <w:t xml:space="preserve">, such as West India and Brazil South, are </w:t>
@@ -11145,21 +11029,7 @@
         <w:rPr>
           <w:highlight w:val="yellow"/>
         </w:rPr>
-        <w:t xml:space="preserve">Brazil South's secondary region is South Central US. The secondary region of </w:t>
-      </w:r>
-      <w:proofErr w:type="gramStart"/>
-      <w:r>
-        <w:rPr>
-          <w:highlight w:val="yellow"/>
-        </w:rPr>
-        <w:t>South Central</w:t>
-      </w:r>
-      <w:proofErr w:type="gramEnd"/>
-      <w:r>
-        <w:rPr>
-          <w:highlight w:val="yellow"/>
-        </w:rPr>
-        <w:t xml:space="preserve"> US isn't Brazil South.</w:t>
+        <w:t>Brazil South's secondary region is South Central US. The secondary region of South Central US isn't Brazil South.</w:t>
       </w:r>
     </w:p>
     <w:p>
@@ -11341,6 +11211,7 @@
         <w:rPr>
           <w:noProof/>
         </w:rPr>
+        <w:lastRenderedPageBreak/>
         <w:drawing>
           <wp:inline distT="0" distB="0" distL="0" distR="0" wp14:anchorId="4CEE1334" wp14:editId="1E27BFC8">
             <wp:extent cx="4838700" cy="2171700"/>
@@ -11649,6 +11520,7 @@
         <w:rPr>
           <w:noProof/>
         </w:rPr>
+        <w:lastRenderedPageBreak/>
         <w:drawing>
           <wp:inline distT="0" distB="0" distL="0" distR="0" wp14:anchorId="64637F37" wp14:editId="1D183D84">
             <wp:extent cx="5943600" cy="2441575"/>
@@ -11896,6 +11768,7 @@
           <w:bCs/>
           <w:highlight w:val="red"/>
         </w:rPr>
+        <w:lastRenderedPageBreak/>
         <w:t>Environments</w:t>
       </w:r>
       <w:r>
@@ -12153,6 +12026,7 @@
         <w:rPr>
           <w:noProof/>
         </w:rPr>
+        <w:lastRenderedPageBreak/>
         <w:drawing>
           <wp:inline distT="0" distB="0" distL="0" distR="0" wp14:anchorId="58144C34" wp14:editId="7B54ACE9">
             <wp:extent cx="5791200" cy="3581400"/>
@@ -12397,6 +12271,7 @@
         </w:numPr>
       </w:pPr>
       <w:r>
+        <w:lastRenderedPageBreak/>
         <w:t xml:space="preserve">Each </w:t>
       </w:r>
       <w:r>
@@ -12860,6 +12735,7 @@
           </w:tcPr>
           <w:p>
             <w:r>
+              <w:lastRenderedPageBreak/>
               <w:t>Size</w:t>
             </w:r>
           </w:p>
@@ -12918,11 +12794,9 @@
             <w:hideMark/>
           </w:tcPr>
           <w:p>
-            <w:proofErr w:type="spellStart"/>
             <w:r>
               <w:t>azureuser</w:t>
             </w:r>
-            <w:proofErr w:type="spellEnd"/>
           </w:p>
         </w:tc>
       </w:tr>
@@ -12968,13 +12842,8 @@
             <w:hideMark/>
           </w:tcPr>
           <w:p>
-            <w:proofErr w:type="spellStart"/>
             <w:r>
-              <w:t>Reenter</w:t>
-            </w:r>
-            <w:proofErr w:type="spellEnd"/>
-            <w:r>
-              <w:t xml:space="preserve"> the custom password</w:t>
+              <w:t>Reenter the custom password</w:t>
             </w:r>
           </w:p>
         </w:tc>
@@ -13216,6 +13085,7 @@
         <w:pStyle w:val="Heading4"/>
       </w:pPr>
       <w:r>
+        <w:lastRenderedPageBreak/>
         <w:t>Clean up</w:t>
       </w:r>
     </w:p>
@@ -13428,6 +13298,7 @@
         <w:pStyle w:val="Heading2"/>
       </w:pPr>
       <w:r>
+        <w:lastRenderedPageBreak/>
         <w:t>Describe Azure compute and networking services</w:t>
       </w:r>
     </w:p>
@@ -13723,6 +13594,7 @@
     </w:p>
     <w:p>
       <w:r>
+        <w:lastRenderedPageBreak/>
         <w:t xml:space="preserve">You </w:t>
       </w:r>
       <w:r>
@@ -14030,15 +13902,7 @@
     </w:p>
     <w:p>
       <w:r>
-        <w:t xml:space="preserve">Availability </w:t>
-      </w:r>
-      <w:proofErr w:type="gramStart"/>
-      <w:r>
-        <w:t>accomplish</w:t>
-      </w:r>
-      <w:proofErr w:type="gramEnd"/>
-      <w:r>
-        <w:t xml:space="preserve"> these objectives by </w:t>
+        <w:t xml:space="preserve">Availability accomplish these objectives by </w:t>
       </w:r>
       <w:r>
         <w:rPr>
@@ -14116,6 +13980,7 @@
           <w:b/>
           <w:bCs/>
         </w:rPr>
+        <w:lastRenderedPageBreak/>
         <w:t>Fault domain</w:t>
       </w:r>
       <w:r>
@@ -14482,6 +14347,7 @@
         <w:pStyle w:val="Heading4"/>
       </w:pPr>
       <w:r>
+        <w:lastRenderedPageBreak/>
         <w:t>VM Resources</w:t>
       </w:r>
     </w:p>
@@ -14659,35 +14525,7 @@
         <w:rPr>
           <w:highlight w:val="yellow"/>
         </w:rPr>
-        <w:t>following </w:t>
-      </w:r>
-      <w:proofErr w:type="spellStart"/>
-      <w:r>
-        <w:rPr>
-          <w:highlight w:val="yellow"/>
-        </w:rPr>
-        <w:t>az</w:t>
-      </w:r>
-      <w:proofErr w:type="spellEnd"/>
-      <w:r>
-        <w:rPr>
-          <w:highlight w:val="yellow"/>
-        </w:rPr>
-        <w:t xml:space="preserve"> </w:t>
-      </w:r>
-      <w:proofErr w:type="spellStart"/>
-      <w:r>
-        <w:rPr>
-          <w:highlight w:val="yellow"/>
-        </w:rPr>
-        <w:t>vm</w:t>
-      </w:r>
-      <w:proofErr w:type="spellEnd"/>
-      <w:r>
-        <w:rPr>
-          <w:highlight w:val="yellow"/>
-        </w:rPr>
-        <w:t xml:space="preserve"> create command to create a Linux VM</w:t>
+        <w:t>following az vm create command to create a Linux VM</w:t>
       </w:r>
       <w:r>
         <w:t>:</w:t>
@@ -14705,21 +14543,8 @@
       <w:pPr>
         <w:pStyle w:val="Code"/>
       </w:pPr>
-      <w:proofErr w:type="spellStart"/>
-      <w:r>
-        <w:t>az</w:t>
-      </w:r>
-      <w:proofErr w:type="spellEnd"/>
-      <w:r>
-        <w:t xml:space="preserve"> </w:t>
-      </w:r>
-      <w:proofErr w:type="spellStart"/>
-      <w:r>
-        <w:t>vm</w:t>
-      </w:r>
-      <w:proofErr w:type="spellEnd"/>
-      <w:r>
-        <w:t xml:space="preserve"> create \</w:t>
+      <w:r>
+        <w:t>az vm create \</w:t>
       </w:r>
     </w:p>
     <w:p>
@@ -14735,15 +14560,7 @@
         <w:pStyle w:val="Code"/>
       </w:pPr>
       <w:r>
-        <w:t xml:space="preserve">  --name my-</w:t>
-      </w:r>
-      <w:proofErr w:type="spellStart"/>
-      <w:r>
-        <w:t>vm</w:t>
-      </w:r>
-      <w:proofErr w:type="spellEnd"/>
-      <w:r>
-        <w:t xml:space="preserve"> \</w:t>
+        <w:t xml:space="preserve">  --name my-vm \</w:t>
       </w:r>
     </w:p>
     <w:p>
@@ -14751,23 +14568,7 @@
         <w:pStyle w:val="Code"/>
       </w:pPr>
       <w:r>
-        <w:t xml:space="preserve">  --public-</w:t>
-      </w:r>
-      <w:proofErr w:type="spellStart"/>
-      <w:r>
-        <w:t>ip</w:t>
-      </w:r>
-      <w:proofErr w:type="spellEnd"/>
-      <w:r>
-        <w:t>-</w:t>
-      </w:r>
-      <w:proofErr w:type="spellStart"/>
-      <w:r>
-        <w:t>sku</w:t>
-      </w:r>
-      <w:proofErr w:type="spellEnd"/>
-      <w:r>
-        <w:t xml:space="preserve"> Standard \</w:t>
+        <w:t xml:space="preserve">  --public-ip-sku Standard \</w:t>
       </w:r>
     </w:p>
     <w:p>
@@ -14783,15 +14584,7 @@
         <w:pStyle w:val="Code"/>
       </w:pPr>
       <w:r>
-        <w:t xml:space="preserve">  --admin-username </w:t>
-      </w:r>
-      <w:proofErr w:type="spellStart"/>
-      <w:r>
-        <w:t>azureuser</w:t>
-      </w:r>
-      <w:proofErr w:type="spellEnd"/>
-      <w:r>
-        <w:t xml:space="preserve"> \</w:t>
+        <w:t xml:space="preserve">  --admin-username azureuser \</w:t>
       </w:r>
     </w:p>
     <w:p>
@@ -14820,17 +14613,8 @@
           <w:b/>
           <w:bCs/>
         </w:rPr>
-        <w:t>my-</w:t>
-      </w:r>
-      <w:proofErr w:type="spellStart"/>
-      <w:r>
-        <w:rPr>
-          <w:b/>
-          <w:bCs/>
-        </w:rPr>
-        <w:t>vm</w:t>
-      </w:r>
-      <w:proofErr w:type="spellEnd"/>
+        <w:t>my-vm</w:t>
+      </w:r>
       <w:r>
         <w:t>. You use this name to refer to the VM in later steps.</w:t>
       </w:r>
@@ -14849,35 +14633,7 @@
         <w:rPr>
           <w:highlight w:val="yellow"/>
         </w:rPr>
-        <w:t>following </w:t>
-      </w:r>
-      <w:proofErr w:type="spellStart"/>
-      <w:r>
-        <w:rPr>
-          <w:highlight w:val="yellow"/>
-        </w:rPr>
-        <w:t>az</w:t>
-      </w:r>
-      <w:proofErr w:type="spellEnd"/>
-      <w:r>
-        <w:rPr>
-          <w:highlight w:val="yellow"/>
-        </w:rPr>
-        <w:t xml:space="preserve"> </w:t>
-      </w:r>
-      <w:proofErr w:type="spellStart"/>
-      <w:r>
-        <w:rPr>
-          <w:highlight w:val="yellow"/>
-        </w:rPr>
-        <w:t>vm</w:t>
-      </w:r>
-      <w:proofErr w:type="spellEnd"/>
-      <w:r>
-        <w:rPr>
-          <w:highlight w:val="yellow"/>
-        </w:rPr>
-        <w:t xml:space="preserve"> extension set command to configure Nginx</w:t>
+        <w:t>following az vm extension set command to configure Nginx</w:t>
       </w:r>
       <w:r>
         <w:t xml:space="preserve"> on your VM:</w:t>
@@ -14888,6 +14644,7 @@
         <w:pStyle w:val="Tips"/>
       </w:pPr>
       <w:r>
+        <w:lastRenderedPageBreak/>
         <w:t>Azure CLI</w:t>
       </w:r>
     </w:p>
@@ -14895,21 +14652,8 @@
       <w:pPr>
         <w:pStyle w:val="Code"/>
       </w:pPr>
-      <w:proofErr w:type="spellStart"/>
-      <w:r>
-        <w:t>az</w:t>
-      </w:r>
-      <w:proofErr w:type="spellEnd"/>
-      <w:r>
-        <w:t xml:space="preserve"> </w:t>
-      </w:r>
-      <w:proofErr w:type="spellStart"/>
-      <w:r>
-        <w:t>vm</w:t>
-      </w:r>
-      <w:proofErr w:type="spellEnd"/>
-      <w:r>
-        <w:t xml:space="preserve"> extension set \</w:t>
+      <w:r>
+        <w:t>az vm extension set \</w:t>
       </w:r>
     </w:p>
     <w:p>
@@ -14925,23 +14669,7 @@
         <w:pStyle w:val="Code"/>
       </w:pPr>
       <w:r>
-        <w:t xml:space="preserve">  --</w:t>
-      </w:r>
-      <w:proofErr w:type="spellStart"/>
-      <w:r>
-        <w:t>vm</w:t>
-      </w:r>
-      <w:proofErr w:type="spellEnd"/>
-      <w:r>
-        <w:t>-name my-</w:t>
-      </w:r>
-      <w:proofErr w:type="spellStart"/>
-      <w:r>
-        <w:t>vm</w:t>
-      </w:r>
-      <w:proofErr w:type="spellEnd"/>
-      <w:r>
-        <w:t xml:space="preserve"> \</w:t>
+        <w:t xml:space="preserve">  --vm-name my-vm \</w:t>
       </w:r>
     </w:p>
     <w:p>
@@ -14949,15 +14677,7 @@
         <w:pStyle w:val="Code"/>
       </w:pPr>
       <w:r>
-        <w:t xml:space="preserve">  --name </w:t>
-      </w:r>
-      <w:proofErr w:type="spellStart"/>
-      <w:r>
-        <w:t>customScript</w:t>
-      </w:r>
-      <w:proofErr w:type="spellEnd"/>
-      <w:r>
-        <w:t xml:space="preserve"> \</w:t>
+        <w:t xml:space="preserve">  --name customScript \</w:t>
       </w:r>
     </w:p>
     <w:p>
@@ -14965,17 +14685,7 @@
         <w:pStyle w:val="Code"/>
       </w:pPr>
       <w:r>
-        <w:t xml:space="preserve">  --publisher </w:t>
-      </w:r>
-      <w:proofErr w:type="spellStart"/>
-      <w:proofErr w:type="gramStart"/>
-      <w:r>
-        <w:t>Microsoft.Azure.Extensions</w:t>
-      </w:r>
-      <w:proofErr w:type="spellEnd"/>
-      <w:proofErr w:type="gramEnd"/>
-      <w:r>
-        <w:t xml:space="preserve"> \</w:t>
+        <w:t xml:space="preserve">  --publisher Microsoft.Azure.Extensions \</w:t>
       </w:r>
     </w:p>
     <w:p>
@@ -14991,15 +14701,7 @@
         <w:pStyle w:val="Code"/>
       </w:pPr>
       <w:r>
-        <w:t xml:space="preserve">  --settings '{"fileUris</w:t>
-      </w:r>
-      <w:proofErr w:type="gramStart"/>
-      <w:r>
-        <w:t>":[</w:t>
-      </w:r>
-      <w:proofErr w:type="gramEnd"/>
-      <w:r>
-        <w:t>"https://raw.githubusercontent.com/MicrosoftDocs/mslearn-welcome-to-azure/master/configure-nginx.sh"]}' \</w:t>
+        <w:t xml:space="preserve">  --settings '{"fileUris":["https://raw.githubusercontent.com/MicrosoftDocs/mslearn-welcome-to-azure/master/configure-nginx.sh"]}' \</w:t>
       </w:r>
     </w:p>
     <w:p>
@@ -15007,15 +14709,7 @@
         <w:pStyle w:val="Code"/>
       </w:pPr>
       <w:r>
-        <w:t xml:space="preserve">  --protected-settings '{"</w:t>
-      </w:r>
-      <w:proofErr w:type="spellStart"/>
-      <w:r>
-        <w:t>commandToExecute</w:t>
-      </w:r>
-      <w:proofErr w:type="spellEnd"/>
-      <w:r>
-        <w:t xml:space="preserve">": "./configure-nginx.sh"}'    </w:t>
+        <w:t xml:space="preserve">  --protected-settings '{"commandToExecute": "./configure-nginx.sh"}'    </w:t>
       </w:r>
     </w:p>
     <w:p>
@@ -15236,6 +14930,7 @@
         <w:pStyle w:val="Heading4"/>
       </w:pPr>
       <w:r>
+        <w:lastRenderedPageBreak/>
         <w:t>Enhance security</w:t>
       </w:r>
     </w:p>
@@ -15905,6 +15600,7 @@
         <w:pStyle w:val="Heading4"/>
       </w:pPr>
       <w:r>
+        <w:lastRenderedPageBreak/>
         <w:t>Serverless computing in Azure</w:t>
       </w:r>
     </w:p>
@@ -16250,6 +15946,7 @@
         <w:rPr>
           <w:highlight w:val="red"/>
         </w:rPr>
+        <w:lastRenderedPageBreak/>
         <w:t>Azure App Service</w:t>
       </w:r>
     </w:p>
@@ -16583,6 +16280,7 @@
         <w:pStyle w:val="Heading5"/>
       </w:pPr>
       <w:r>
+        <w:lastRenderedPageBreak/>
         <w:t>API apps</w:t>
       </w:r>
     </w:p>
@@ -16646,15 +16344,7 @@
         <w:t>script</w:t>
       </w:r>
       <w:r>
-        <w:t xml:space="preserve"> (.</w:t>
-      </w:r>
-      <w:proofErr w:type="spellStart"/>
-      <w:r>
-        <w:t>cmd</w:t>
-      </w:r>
-      <w:proofErr w:type="spellEnd"/>
-      <w:r>
-        <w:t xml:space="preserve">, .bat, PowerShell, or Bash) in the same context as a web app, API app, or mobile app. They can be </w:t>
+        <w:t xml:space="preserve"> (.cmd, .bat, PowerShell, or Bash) in the same context as a web app, API app, or mobile app. They can be </w:t>
       </w:r>
       <w:r>
         <w:rPr>
@@ -16900,6 +16590,7 @@
         </w:numPr>
       </w:pPr>
       <w:r>
+        <w:lastRenderedPageBreak/>
         <w:t>Route network traffic</w:t>
       </w:r>
     </w:p>
@@ -17239,6 +16930,7 @@
         <w:pStyle w:val="Heading4"/>
       </w:pPr>
       <w:r>
+        <w:lastRenderedPageBreak/>
         <w:t>Communicate with on-premises resources</w:t>
       </w:r>
     </w:p>
@@ -17599,7 +17291,11 @@
         <w:t>compared to a hardened network appliance</w:t>
       </w:r>
       <w:r>
-        <w:t xml:space="preserve">. A network virtual appliance carries out a particular network function, such as </w:t>
+        <w:t xml:space="preserve">. A network virtual appliance carries out a particular </w:t>
+      </w:r>
+      <w:r>
+        <w:lastRenderedPageBreak/>
+        <w:t xml:space="preserve">network function, such as </w:t>
       </w:r>
       <w:r>
         <w:rPr>
@@ -17820,65 +17516,108 @@
       <w:pPr>
         <w:pStyle w:val="Code"/>
       </w:pPr>
-      <w:proofErr w:type="spellStart"/>
-      <w:r>
-        <w:t>az</w:t>
-      </w:r>
-      <w:proofErr w:type="spellEnd"/>
+      <w:r>
+        <w:t>az vm list</w:t>
+      </w:r>
+    </w:p>
+    <w:p>
+      <w:r>
+        <w:rPr>
+          <w:highlight w:val="yellow"/>
+        </w:rPr>
+        <w:t>If you receive an empty response [],</w:t>
+      </w:r>
+      <w:r>
+        <w:t xml:space="preserve"> you need to </w:t>
+      </w:r>
+      <w:r>
+        <w:rPr>
+          <w:highlight w:val="yellow"/>
+        </w:rPr>
+        <w:t>complete the first exercise</w:t>
+      </w:r>
+      <w:r>
+        <w:t xml:space="preserve"> in this module again. </w:t>
+      </w:r>
+      <w:r>
+        <w:rPr>
+          <w:highlight w:val="yellow"/>
+        </w:rPr>
+        <w:t>If the result lists</w:t>
+      </w:r>
+      <w:r>
+        <w:t xml:space="preserve"> your current </w:t>
+      </w:r>
+      <w:r>
+        <w:rPr>
+          <w:highlight w:val="yellow"/>
+        </w:rPr>
+        <w:t>VM and its settings</w:t>
+      </w:r>
+      <w:r>
+        <w:t xml:space="preserve">, you may </w:t>
+      </w:r>
+      <w:r>
+        <w:rPr>
+          <w:highlight w:val="yellow"/>
+        </w:rPr>
+        <w:t>continue</w:t>
+      </w:r>
+      <w:r>
+        <w:t>.</w:t>
+      </w:r>
+    </w:p>
+    <w:p>
+      <w:r>
+        <w:t>Right now,</w:t>
+      </w:r>
       <w:r>
         <w:t xml:space="preserve"> </w:t>
       </w:r>
-      <w:proofErr w:type="spellStart"/>
-      <w:r>
-        <w:t>vm</w:t>
-      </w:r>
-      <w:proofErr w:type="spellEnd"/>
-      <w:r>
-        <w:t xml:space="preserve"> list</w:t>
-      </w:r>
-    </w:p>
-    <w:p>
-      <w:r>
-        <w:rPr>
-          <w:highlight w:val="yellow"/>
-        </w:rPr>
-        <w:t>If you receive an empty response [],</w:t>
-      </w:r>
-      <w:r>
-        <w:t xml:space="preserve"> you need to </w:t>
-      </w:r>
-      <w:r>
-        <w:rPr>
-          <w:highlight w:val="yellow"/>
-        </w:rPr>
-        <w:t>complete the first exercise</w:t>
-      </w:r>
-      <w:r>
-        <w:t xml:space="preserve"> in this module again. </w:t>
-      </w:r>
-      <w:r>
-        <w:rPr>
-          <w:highlight w:val="yellow"/>
-        </w:rPr>
-        <w:t>If the result lists</w:t>
-      </w:r>
-      <w:r>
-        <w:t xml:space="preserve"> your current </w:t>
-      </w:r>
-      <w:r>
-        <w:rPr>
-          <w:highlight w:val="yellow"/>
-        </w:rPr>
-        <w:t>VM and its settings</w:t>
-      </w:r>
-      <w:r>
-        <w:t xml:space="preserve">, you may </w:t>
-      </w:r>
-      <w:r>
-        <w:rPr>
-          <w:highlight w:val="yellow"/>
-        </w:rPr>
-        <w:t>continue</w:t>
+      <w:r>
+        <w:t xml:space="preserve">When </w:t>
+      </w:r>
+      <w:r>
+        <w:rPr>
+          <w:highlight w:val="yellow"/>
+        </w:rPr>
+        <w:t>you create a Virtual Machine (VM)</w:t>
+      </w:r>
+      <w:r>
+        <w:t xml:space="preserve"> in Azure </w:t>
+      </w:r>
+      <w:r>
+        <w:rPr>
+          <w:highlight w:val="yellow"/>
+        </w:rPr>
+        <w:t>and install a web server like Nginx</w:t>
+      </w:r>
+      <w:r>
+        <w:t xml:space="preserve">, the </w:t>
+      </w:r>
+      <w:r>
+        <w:rPr>
+          <w:highlight w:val="yellow"/>
+        </w:rPr>
+        <w:t>server listens for incoming HTTP requests on port 80</w:t>
+      </w:r>
+      <w:r>
+        <w:t>. However, A</w:t>
+      </w:r>
+      <w:r>
+        <w:rPr>
+          <w:highlight w:val="yellow"/>
+        </w:rPr>
+        <w:t>zure blocks most inbound traffic by default</w:t>
+      </w:r>
+      <w:r>
+        <w:t xml:space="preserve"> for </w:t>
+      </w:r>
+      <w:r>
+        <w:rPr>
+          <w:color w:val="0070C0"/>
+        </w:rPr>
+        <w:t>security reasons</w:t>
       </w:r>
       <w:r>
         <w:t>.</w:t>
@@ -17886,88 +17625,27 @@
     </w:p>
     <w:p>
       <w:r>
-        <w:t>Right now,</w:t>
-      </w:r>
-      <w:r>
-        <w:t xml:space="preserve"> </w:t>
-      </w:r>
-      <w:proofErr w:type="gramStart"/>
-      <w:r>
-        <w:t>When</w:t>
-      </w:r>
-      <w:proofErr w:type="gramEnd"/>
-      <w:r>
-        <w:t xml:space="preserve"> </w:t>
-      </w:r>
-      <w:r>
-        <w:rPr>
-          <w:highlight w:val="yellow"/>
-        </w:rPr>
-        <w:t>you create a Virtual Machine (VM)</w:t>
-      </w:r>
-      <w:r>
-        <w:t xml:space="preserve"> in Azure </w:t>
-      </w:r>
-      <w:r>
-        <w:rPr>
-          <w:highlight w:val="yellow"/>
-        </w:rPr>
-        <w:t>and install a web server like Nginx</w:t>
-      </w:r>
-      <w:r>
-        <w:t xml:space="preserve">, the </w:t>
-      </w:r>
-      <w:r>
-        <w:rPr>
-          <w:highlight w:val="yellow"/>
-        </w:rPr>
-        <w:t>server listens for incoming HTTP requests on port 80</w:t>
-      </w:r>
-      <w:r>
-        <w:t>. However, A</w:t>
-      </w:r>
-      <w:r>
-        <w:rPr>
-          <w:highlight w:val="yellow"/>
-        </w:rPr>
-        <w:t>zure blocks most inbound traffic by default</w:t>
-      </w:r>
-      <w:r>
-        <w:t xml:space="preserve"> for </w:t>
+        <w:rPr>
+          <w:highlight w:val="cyan"/>
+        </w:rPr>
+        <w:t>To make your Nginx server accessible</w:t>
+      </w:r>
+      <w:r>
+        <w:t xml:space="preserve"> from the internet, you </w:t>
+      </w:r>
+      <w:r>
+        <w:rPr>
+          <w:highlight w:val="cyan"/>
+        </w:rPr>
+        <w:t>need to open port 80 using a Network Security Group (NSG).</w:t>
+      </w:r>
+      <w:r>
+        <w:t xml:space="preserve"> This </w:t>
       </w:r>
       <w:r>
         <w:rPr>
           <w:color w:val="0070C0"/>
         </w:rPr>
-        <w:t>security reasons</w:t>
-      </w:r>
-      <w:r>
-        <w:t>.</w:t>
-      </w:r>
-    </w:p>
-    <w:p>
-      <w:r>
-        <w:rPr>
-          <w:highlight w:val="cyan"/>
-        </w:rPr>
-        <w:t>To make your Nginx server accessible</w:t>
-      </w:r>
-      <w:r>
-        <w:t xml:space="preserve"> from the internet, you </w:t>
-      </w:r>
-      <w:r>
-        <w:rPr>
-          <w:highlight w:val="cyan"/>
-        </w:rPr>
-        <w:t>need to open port 80 using a Network Security Group (NSG).</w:t>
-      </w:r>
-      <w:r>
-        <w:t xml:space="preserve"> This </w:t>
-      </w:r>
-      <w:r>
-        <w:rPr>
-          <w:color w:val="0070C0"/>
-        </w:rPr>
         <w:t>allows users to connect to your website</w:t>
       </w:r>
       <w:r>
@@ -17979,6 +17657,7 @@
         <w:pStyle w:val="Heading4"/>
       </w:pPr>
       <w:r>
+        <w:lastRenderedPageBreak/>
         <w:t>Task 1: Access your web server</w:t>
       </w:r>
     </w:p>
@@ -18024,53 +17703,12 @@
       <w:r>
         <w:t>Run the following </w:t>
       </w:r>
-      <w:proofErr w:type="spellStart"/>
       <w:r>
         <w:rPr>
           <w:rStyle w:val="CodeChar"/>
           <w:highlight w:val="magenta"/>
         </w:rPr>
-        <w:t>az</w:t>
-      </w:r>
-      <w:proofErr w:type="spellEnd"/>
-      <w:r>
-        <w:rPr>
-          <w:rStyle w:val="CodeChar"/>
-          <w:highlight w:val="magenta"/>
-        </w:rPr>
-        <w:t xml:space="preserve"> </w:t>
-      </w:r>
-      <w:proofErr w:type="spellStart"/>
-      <w:r>
-        <w:rPr>
-          <w:rStyle w:val="CodeChar"/>
-          <w:highlight w:val="magenta"/>
-        </w:rPr>
-        <w:t>vm</w:t>
-      </w:r>
-      <w:proofErr w:type="spellEnd"/>
-      <w:r>
-        <w:rPr>
-          <w:rStyle w:val="CodeChar"/>
-          <w:highlight w:val="magenta"/>
-        </w:rPr>
-        <w:t xml:space="preserve"> list-</w:t>
-      </w:r>
-      <w:proofErr w:type="spellStart"/>
-      <w:r>
-        <w:rPr>
-          <w:rStyle w:val="CodeChar"/>
-          <w:highlight w:val="magenta"/>
-        </w:rPr>
-        <w:t>ip</w:t>
-      </w:r>
-      <w:proofErr w:type="spellEnd"/>
-      <w:r>
-        <w:rPr>
-          <w:rStyle w:val="CodeChar"/>
-          <w:highlight w:val="magenta"/>
-        </w:rPr>
-        <w:t>-addresses</w:t>
+        <w:t>az vm list-ip-addresses</w:t>
       </w:r>
       <w:r>
         <w:t xml:space="preserve"> command to </w:t>
@@ -18098,31 +17736,7 @@
         <w:pStyle w:val="Code"/>
       </w:pPr>
       <w:r>
-        <w:t>IPADDRESS="$(</w:t>
-      </w:r>
-      <w:proofErr w:type="spellStart"/>
-      <w:r>
-        <w:t>az</w:t>
-      </w:r>
-      <w:proofErr w:type="spellEnd"/>
-      <w:r>
-        <w:t xml:space="preserve"> </w:t>
-      </w:r>
-      <w:proofErr w:type="spellStart"/>
-      <w:r>
-        <w:t>vm</w:t>
-      </w:r>
-      <w:proofErr w:type="spellEnd"/>
-      <w:r>
-        <w:t xml:space="preserve"> list-</w:t>
-      </w:r>
-      <w:proofErr w:type="spellStart"/>
-      <w:r>
-        <w:t>ip</w:t>
-      </w:r>
-      <w:proofErr w:type="spellEnd"/>
-      <w:r>
-        <w:t>-addresses \</w:t>
+        <w:t>IPADDRESS="$(az vm list-ip-addresses \</w:t>
       </w:r>
     </w:p>
     <w:p>
@@ -18138,15 +17752,7 @@
         <w:pStyle w:val="Code"/>
       </w:pPr>
       <w:r>
-        <w:t xml:space="preserve">  --name my-</w:t>
-      </w:r>
-      <w:proofErr w:type="spellStart"/>
-      <w:r>
-        <w:t>vm</w:t>
-      </w:r>
-      <w:proofErr w:type="spellEnd"/>
-      <w:r>
-        <w:t xml:space="preserve"> \</w:t>
+        <w:t xml:space="preserve">  --name my-vm \</w:t>
       </w:r>
     </w:p>
     <w:p>
@@ -18154,44 +17760,7 @@
         <w:pStyle w:val="Code"/>
       </w:pPr>
       <w:r>
-        <w:t xml:space="preserve">  --query "[</w:t>
-      </w:r>
-      <w:proofErr w:type="gramStart"/>
-      <w:r>
-        <w:t>].</w:t>
-      </w:r>
-      <w:proofErr w:type="spellStart"/>
-      <w:r>
-        <w:t>virtualMachine.network</w:t>
-      </w:r>
-      <w:proofErr w:type="gramEnd"/>
-      <w:r>
-        <w:t>.</w:t>
-      </w:r>
-      <w:proofErr w:type="gramStart"/>
-      <w:r>
-        <w:t>publicIpAddresses</w:t>
-      </w:r>
-      <w:proofErr w:type="spellEnd"/>
-      <w:r>
-        <w:t>[</w:t>
-      </w:r>
-      <w:proofErr w:type="gramEnd"/>
-      <w:r>
-        <w:t>*</w:t>
-      </w:r>
-      <w:proofErr w:type="gramStart"/>
-      <w:r>
-        <w:t>].</w:t>
-      </w:r>
-      <w:proofErr w:type="spellStart"/>
-      <w:r>
-        <w:t>ipAddress</w:t>
-      </w:r>
-      <w:proofErr w:type="spellEnd"/>
-      <w:proofErr w:type="gramEnd"/>
-      <w:r>
-        <w:t>" \</w:t>
+        <w:t xml:space="preserve">  --query "[].virtualMachine.network.publicIpAddresses[*].ipAddress" \</w:t>
       </w:r>
     </w:p>
     <w:p>
@@ -18199,15 +17768,7 @@
         <w:pStyle w:val="Code"/>
       </w:pPr>
       <w:r>
-        <w:t xml:space="preserve">  --output </w:t>
-      </w:r>
-      <w:proofErr w:type="spellStart"/>
-      <w:r>
-        <w:t>tsv</w:t>
-      </w:r>
-      <w:proofErr w:type="spellEnd"/>
-      <w:r>
-        <w:t xml:space="preserve">)"    </w:t>
+        <w:t xml:space="preserve">  --output tsv)"    </w:t>
       </w:r>
     </w:p>
     <w:p>
@@ -18391,6 +17952,7 @@
         <w:rPr>
           <w:noProof/>
         </w:rPr>
+        <w:lastRenderedPageBreak/>
         <w:drawing>
           <wp:inline distT="0" distB="0" distL="0" distR="0" wp14:anchorId="5E76EF07" wp14:editId="29D22A5A">
             <wp:extent cx="5943600" cy="4626610"/>
@@ -18484,37 +18046,12 @@
       <w:r>
         <w:t>Run the following </w:t>
       </w:r>
-      <w:proofErr w:type="spellStart"/>
       <w:r>
         <w:rPr>
           <w:rStyle w:val="CodeChar"/>
           <w:highlight w:val="magenta"/>
         </w:rPr>
-        <w:t>az</w:t>
-      </w:r>
-      <w:proofErr w:type="spellEnd"/>
-      <w:r>
-        <w:rPr>
-          <w:rStyle w:val="CodeChar"/>
-          <w:highlight w:val="magenta"/>
-        </w:rPr>
-        <w:t xml:space="preserve"> network </w:t>
-      </w:r>
-      <w:proofErr w:type="spellStart"/>
-      <w:r>
-        <w:rPr>
-          <w:rStyle w:val="CodeChar"/>
-          <w:highlight w:val="magenta"/>
-        </w:rPr>
-        <w:t>nsg</w:t>
-      </w:r>
-      <w:proofErr w:type="spellEnd"/>
-      <w:r>
-        <w:rPr>
-          <w:rStyle w:val="CodeChar"/>
-          <w:highlight w:val="magenta"/>
-        </w:rPr>
-        <w:t xml:space="preserve"> list</w:t>
+        <w:t>az network nsg list</w:t>
       </w:r>
       <w:r>
         <w:t xml:space="preserve"> command </w:t>
@@ -18547,21 +18084,8 @@
       <w:pPr>
         <w:pStyle w:val="Code"/>
       </w:pPr>
-      <w:proofErr w:type="spellStart"/>
-      <w:r>
-        <w:t>az</w:t>
-      </w:r>
-      <w:proofErr w:type="spellEnd"/>
-      <w:r>
-        <w:t xml:space="preserve"> network </w:t>
-      </w:r>
-      <w:proofErr w:type="spellStart"/>
-      <w:r>
-        <w:t>nsg</w:t>
-      </w:r>
-      <w:proofErr w:type="spellEnd"/>
-      <w:r>
-        <w:t xml:space="preserve"> list \</w:t>
+      <w:r>
+        <w:t>az network nsg list \</w:t>
       </w:r>
     </w:p>
     <w:p>
@@ -18585,15 +18109,7 @@
         <w:pStyle w:val="Code"/>
       </w:pPr>
       <w:r>
-        <w:t xml:space="preserve">  --output </w:t>
-      </w:r>
-      <w:proofErr w:type="spellStart"/>
-      <w:r>
-        <w:t>tsv</w:t>
-      </w:r>
-      <w:proofErr w:type="spellEnd"/>
-      <w:r>
-        <w:t xml:space="preserve">    </w:t>
+        <w:t xml:space="preserve">  --output tsv    </w:t>
       </w:r>
     </w:p>
     <w:p>
@@ -18606,6 +18122,7 @@
         <w:pStyle w:val="Tips"/>
       </w:pPr>
       <w:r>
+        <w:lastRenderedPageBreak/>
         <w:t>Output</w:t>
       </w:r>
     </w:p>
@@ -18614,13 +18131,8 @@
         <w:pStyle w:val="Code"/>
       </w:pPr>
       <w:r>
-        <w:t>my-</w:t>
-      </w:r>
-      <w:proofErr w:type="spellStart"/>
-      <w:r>
-        <w:t>vmNSG</w:t>
-      </w:r>
-      <w:proofErr w:type="spellEnd"/>
+        <w:t>my-vmNSG</w:t>
+      </w:r>
     </w:p>
     <w:p>
       <w:r>
@@ -18640,17 +18152,8 @@
           <w:i/>
           <w:iCs/>
         </w:rPr>
-        <w:t>my-</w:t>
-      </w:r>
-      <w:proofErr w:type="spellStart"/>
-      <w:r>
-        <w:rPr>
-          <w:i/>
-          <w:iCs/>
-        </w:rPr>
-        <w:t>vmNSG</w:t>
-      </w:r>
-      <w:proofErr w:type="spellEnd"/>
+        <w:t>my-vmNSG</w:t>
+      </w:r>
       <w:r>
         <w:t>.</w:t>
       </w:r>
@@ -18665,37 +18168,12 @@
       <w:r>
         <w:t>Run the following </w:t>
       </w:r>
-      <w:proofErr w:type="spellStart"/>
       <w:r>
         <w:rPr>
           <w:rStyle w:val="CodeChar"/>
           <w:highlight w:val="magenta"/>
         </w:rPr>
-        <w:t>az</w:t>
-      </w:r>
-      <w:proofErr w:type="spellEnd"/>
-      <w:r>
-        <w:rPr>
-          <w:rStyle w:val="CodeChar"/>
-          <w:highlight w:val="magenta"/>
-        </w:rPr>
-        <w:t xml:space="preserve"> network </w:t>
-      </w:r>
-      <w:proofErr w:type="spellStart"/>
-      <w:r>
-        <w:rPr>
-          <w:rStyle w:val="CodeChar"/>
-          <w:highlight w:val="magenta"/>
-        </w:rPr>
-        <w:t>nsg</w:t>
-      </w:r>
-      <w:proofErr w:type="spellEnd"/>
-      <w:r>
-        <w:rPr>
-          <w:rStyle w:val="CodeChar"/>
-          <w:highlight w:val="magenta"/>
-        </w:rPr>
-        <w:t xml:space="preserve"> rule list</w:t>
+        <w:t>az network nsg rule list</w:t>
       </w:r>
       <w:r>
         <w:t xml:space="preserve"> command to </w:t>
@@ -18714,17 +18192,8 @@
           <w:i/>
           <w:iCs/>
         </w:rPr>
-        <w:t>my-</w:t>
-      </w:r>
-      <w:proofErr w:type="spellStart"/>
-      <w:r>
-        <w:rPr>
-          <w:i/>
-          <w:iCs/>
-        </w:rPr>
-        <w:t>vmNSG</w:t>
-      </w:r>
-      <w:proofErr w:type="spellEnd"/>
+        <w:t>my-vmNSG</w:t>
+      </w:r>
       <w:r>
         <w:t>:</w:t>
       </w:r>
@@ -18741,21 +18210,8 @@
       <w:pPr>
         <w:pStyle w:val="Code"/>
       </w:pPr>
-      <w:proofErr w:type="spellStart"/>
-      <w:r>
-        <w:t>az</w:t>
-      </w:r>
-      <w:proofErr w:type="spellEnd"/>
-      <w:r>
-        <w:t xml:space="preserve"> network </w:t>
-      </w:r>
-      <w:proofErr w:type="spellStart"/>
-      <w:r>
-        <w:t>nsg</w:t>
-      </w:r>
-      <w:proofErr w:type="spellEnd"/>
-      <w:r>
-        <w:t xml:space="preserve"> rule list \</w:t>
+      <w:r>
+        <w:t>az network nsg rule list \</w:t>
       </w:r>
     </w:p>
     <w:p>
@@ -18771,23 +18227,7 @@
         <w:pStyle w:val="Code"/>
       </w:pPr>
       <w:r>
-        <w:t xml:space="preserve">  --</w:t>
-      </w:r>
-      <w:proofErr w:type="spellStart"/>
-      <w:r>
-        <w:t>nsg</w:t>
-      </w:r>
-      <w:proofErr w:type="spellEnd"/>
-      <w:r>
-        <w:t>-name my-</w:t>
-      </w:r>
-      <w:proofErr w:type="spellStart"/>
-      <w:r>
-        <w:t>vmNSG</w:t>
-      </w:r>
-      <w:proofErr w:type="spellEnd"/>
-      <w:r>
-        <w:t xml:space="preserve">    </w:t>
+        <w:t xml:space="preserve">  --nsg-name my-vmNSG    </w:t>
       </w:r>
     </w:p>
     <w:p>
@@ -18814,37 +18254,12 @@
       <w:r>
         <w:t>Run the </w:t>
       </w:r>
-      <w:proofErr w:type="spellStart"/>
       <w:r>
         <w:rPr>
           <w:rStyle w:val="CodeChar"/>
           <w:highlight w:val="magenta"/>
         </w:rPr>
-        <w:t>az</w:t>
-      </w:r>
-      <w:proofErr w:type="spellEnd"/>
-      <w:r>
-        <w:rPr>
-          <w:rStyle w:val="CodeChar"/>
-          <w:highlight w:val="magenta"/>
-        </w:rPr>
-        <w:t xml:space="preserve"> network </w:t>
-      </w:r>
-      <w:proofErr w:type="spellStart"/>
-      <w:r>
-        <w:rPr>
-          <w:rStyle w:val="CodeChar"/>
-          <w:highlight w:val="magenta"/>
-        </w:rPr>
-        <w:t>nsg</w:t>
-      </w:r>
-      <w:proofErr w:type="spellEnd"/>
-      <w:r>
-        <w:rPr>
-          <w:rStyle w:val="CodeChar"/>
-          <w:highlight w:val="magenta"/>
-        </w:rPr>
-        <w:t xml:space="preserve"> rule list</w:t>
+        <w:t>az network nsg rule list</w:t>
       </w:r>
       <w:r>
         <w:t> command a second time. This time, use the </w:t>
@@ -18908,21 +18323,8 @@
       <w:pPr>
         <w:pStyle w:val="Code"/>
       </w:pPr>
-      <w:proofErr w:type="spellStart"/>
-      <w:r>
-        <w:t>az</w:t>
-      </w:r>
-      <w:proofErr w:type="spellEnd"/>
-      <w:r>
-        <w:t xml:space="preserve"> network </w:t>
-      </w:r>
-      <w:proofErr w:type="spellStart"/>
-      <w:r>
-        <w:t>nsg</w:t>
-      </w:r>
-      <w:proofErr w:type="spellEnd"/>
-      <w:r>
-        <w:t xml:space="preserve"> rule list \</w:t>
+      <w:r>
+        <w:t>az network nsg rule list \</w:t>
       </w:r>
     </w:p>
     <w:p>
@@ -18938,23 +18340,7 @@
         <w:pStyle w:val="Code"/>
       </w:pPr>
       <w:r>
-        <w:t xml:space="preserve">  --</w:t>
-      </w:r>
-      <w:proofErr w:type="spellStart"/>
-      <w:r>
-        <w:t>nsg</w:t>
-      </w:r>
-      <w:proofErr w:type="spellEnd"/>
-      <w:r>
-        <w:t>-name my-</w:t>
-      </w:r>
-      <w:proofErr w:type="spellStart"/>
-      <w:r>
-        <w:t>vmNSG</w:t>
-      </w:r>
-      <w:proofErr w:type="spellEnd"/>
-      <w:r>
-        <w:t xml:space="preserve"> \</w:t>
+        <w:t xml:space="preserve">  --nsg-name my-vmNSG \</w:t>
       </w:r>
     </w:p>
     <w:p>
@@ -18962,50 +18348,7 @@
         <w:pStyle w:val="Code"/>
       </w:pPr>
       <w:r>
-        <w:t xml:space="preserve">  --query '[</w:t>
-      </w:r>
-      <w:proofErr w:type="gramStart"/>
-      <w:r>
-        <w:t>].{</w:t>
-      </w:r>
-      <w:proofErr w:type="spellStart"/>
-      <w:proofErr w:type="gramEnd"/>
-      <w:r>
-        <w:t>Name:name</w:t>
-      </w:r>
-      <w:proofErr w:type="spellEnd"/>
-      <w:r>
-        <w:t xml:space="preserve">, </w:t>
-      </w:r>
-      <w:proofErr w:type="spellStart"/>
-      <w:proofErr w:type="gramStart"/>
-      <w:r>
-        <w:t>Priority:priority</w:t>
-      </w:r>
-      <w:proofErr w:type="spellEnd"/>
-      <w:proofErr w:type="gramEnd"/>
-      <w:r>
-        <w:t xml:space="preserve">, </w:t>
-      </w:r>
-      <w:proofErr w:type="spellStart"/>
-      <w:proofErr w:type="gramStart"/>
-      <w:r>
-        <w:t>Port:destinationPortRange</w:t>
-      </w:r>
-      <w:proofErr w:type="spellEnd"/>
-      <w:proofErr w:type="gramEnd"/>
-      <w:r>
-        <w:t xml:space="preserve">, </w:t>
-      </w:r>
-      <w:proofErr w:type="spellStart"/>
-      <w:proofErr w:type="gramStart"/>
-      <w:r>
-        <w:t>Access:access</w:t>
-      </w:r>
-      <w:proofErr w:type="spellEnd"/>
-      <w:proofErr w:type="gramEnd"/>
-      <w:r>
-        <w:t>}' \</w:t>
+        <w:t xml:space="preserve">  --query '[].{Name:name, Priority:priority, Port:destinationPortRange, Access:access}' \</w:t>
       </w:r>
     </w:p>
     <w:p>
@@ -19056,15 +18399,7 @@
         <w:pStyle w:val="Code"/>
       </w:pPr>
       <w:r>
-        <w:t>default-allow-</w:t>
-      </w:r>
-      <w:proofErr w:type="gramStart"/>
-      <w:r>
-        <w:t>ssh  1000</w:t>
-      </w:r>
-      <w:proofErr w:type="gramEnd"/>
-      <w:r>
-        <w:t xml:space="preserve">        22      Allow</w:t>
+        <w:t>default-allow-ssh  1000        22      Allow</w:t>
       </w:r>
     </w:p>
     <w:p>
@@ -19106,7 +18441,11 @@
         <w:t>used on Linux to allow administrators</w:t>
       </w:r>
       <w:r>
-        <w:t xml:space="preserve"> to access the system remotely. The </w:t>
+        <w:t xml:space="preserve"> to </w:t>
+      </w:r>
+      <w:r>
+        <w:lastRenderedPageBreak/>
+        <w:t xml:space="preserve">access the system remotely. The </w:t>
       </w:r>
       <w:r>
         <w:rPr>
@@ -19194,37 +18533,12 @@
       <w:r>
         <w:t>Run the following </w:t>
       </w:r>
-      <w:proofErr w:type="spellStart"/>
       <w:r>
         <w:rPr>
           <w:rStyle w:val="CodeChar"/>
           <w:highlight w:val="magenta"/>
         </w:rPr>
-        <w:t>az</w:t>
-      </w:r>
-      <w:proofErr w:type="spellEnd"/>
-      <w:r>
-        <w:rPr>
-          <w:rStyle w:val="CodeChar"/>
-          <w:highlight w:val="magenta"/>
-        </w:rPr>
-        <w:t xml:space="preserve"> network </w:t>
-      </w:r>
-      <w:proofErr w:type="spellStart"/>
-      <w:r>
-        <w:rPr>
-          <w:rStyle w:val="CodeChar"/>
-          <w:highlight w:val="magenta"/>
-        </w:rPr>
-        <w:t>nsg</w:t>
-      </w:r>
-      <w:proofErr w:type="spellEnd"/>
-      <w:r>
-        <w:rPr>
-          <w:rStyle w:val="CodeChar"/>
-          <w:highlight w:val="magenta"/>
-        </w:rPr>
-        <w:t xml:space="preserve"> rule</w:t>
+        <w:t>az network nsg rule</w:t>
       </w:r>
       <w:r>
         <w:t xml:space="preserve"> create command to </w:t>
@@ -19268,21 +18582,8 @@
       <w:pPr>
         <w:pStyle w:val="Code"/>
       </w:pPr>
-      <w:proofErr w:type="spellStart"/>
-      <w:r>
-        <w:t>az</w:t>
-      </w:r>
-      <w:proofErr w:type="spellEnd"/>
-      <w:r>
-        <w:t xml:space="preserve"> network </w:t>
-      </w:r>
-      <w:proofErr w:type="spellStart"/>
-      <w:r>
-        <w:t>nsg</w:t>
-      </w:r>
-      <w:proofErr w:type="spellEnd"/>
-      <w:r>
-        <w:t xml:space="preserve"> rule create \</w:t>
+      <w:r>
+        <w:t>az network nsg rule create \</w:t>
       </w:r>
     </w:p>
     <w:p>
@@ -19298,23 +18599,7 @@
         <w:pStyle w:val="Code"/>
       </w:pPr>
       <w:r>
-        <w:t xml:space="preserve">  --</w:t>
-      </w:r>
-      <w:proofErr w:type="spellStart"/>
-      <w:r>
-        <w:t>nsg</w:t>
-      </w:r>
-      <w:proofErr w:type="spellEnd"/>
-      <w:r>
-        <w:t>-name my-</w:t>
-      </w:r>
-      <w:proofErr w:type="spellStart"/>
-      <w:r>
-        <w:t>vmNSG</w:t>
-      </w:r>
-      <w:proofErr w:type="spellEnd"/>
-      <w:r>
-        <w:t xml:space="preserve"> \</w:t>
+        <w:t xml:space="preserve">  --nsg-name my-vmNSG \</w:t>
       </w:r>
     </w:p>
     <w:p>
@@ -19330,15 +18615,7 @@
         <w:pStyle w:val="Code"/>
       </w:pPr>
       <w:r>
-        <w:t xml:space="preserve">  --protocol </w:t>
-      </w:r>
-      <w:proofErr w:type="spellStart"/>
-      <w:r>
-        <w:t>tcp</w:t>
-      </w:r>
-      <w:proofErr w:type="spellEnd"/>
-      <w:r>
-        <w:t xml:space="preserve"> \</w:t>
+        <w:t xml:space="preserve">  --protocol tcp \</w:t>
       </w:r>
     </w:p>
     <w:p>
@@ -19407,37 +18684,12 @@
       <w:r>
         <w:t>To verify the configuration, run </w:t>
       </w:r>
-      <w:proofErr w:type="spellStart"/>
       <w:r>
         <w:rPr>
           <w:rStyle w:val="CodeChar"/>
           <w:highlight w:val="magenta"/>
         </w:rPr>
-        <w:t>az</w:t>
-      </w:r>
-      <w:proofErr w:type="spellEnd"/>
-      <w:r>
-        <w:rPr>
-          <w:rStyle w:val="CodeChar"/>
-          <w:highlight w:val="magenta"/>
-        </w:rPr>
-        <w:t xml:space="preserve"> network </w:t>
-      </w:r>
-      <w:proofErr w:type="spellStart"/>
-      <w:r>
-        <w:rPr>
-          <w:rStyle w:val="CodeChar"/>
-          <w:highlight w:val="magenta"/>
-        </w:rPr>
-        <w:t>nsg</w:t>
-      </w:r>
-      <w:proofErr w:type="spellEnd"/>
-      <w:r>
-        <w:rPr>
-          <w:rStyle w:val="CodeChar"/>
-          <w:highlight w:val="magenta"/>
-        </w:rPr>
-        <w:t xml:space="preserve"> rule list</w:t>
+        <w:t>az network nsg rule list</w:t>
       </w:r>
       <w:r>
         <w:t> </w:t>
@@ -19461,21 +18713,8 @@
       <w:pPr>
         <w:pStyle w:val="Code"/>
       </w:pPr>
-      <w:proofErr w:type="spellStart"/>
-      <w:r>
-        <w:t>az</w:t>
-      </w:r>
-      <w:proofErr w:type="spellEnd"/>
-      <w:r>
-        <w:t xml:space="preserve"> network </w:t>
-      </w:r>
-      <w:proofErr w:type="spellStart"/>
-      <w:r>
-        <w:t>nsg</w:t>
-      </w:r>
-      <w:proofErr w:type="spellEnd"/>
-      <w:r>
-        <w:t xml:space="preserve"> rule list \</w:t>
+      <w:r>
+        <w:t>az network nsg rule list \</w:t>
       </w:r>
     </w:p>
     <w:p>
@@ -19491,23 +18730,7 @@
         <w:pStyle w:val="Code"/>
       </w:pPr>
       <w:r>
-        <w:t xml:space="preserve">  --</w:t>
-      </w:r>
-      <w:proofErr w:type="spellStart"/>
-      <w:r>
-        <w:t>nsg</w:t>
-      </w:r>
-      <w:proofErr w:type="spellEnd"/>
-      <w:r>
-        <w:t>-name my-</w:t>
-      </w:r>
-      <w:proofErr w:type="spellStart"/>
-      <w:r>
-        <w:t>vmNSG</w:t>
-      </w:r>
-      <w:proofErr w:type="spellEnd"/>
-      <w:r>
-        <w:t xml:space="preserve"> \</w:t>
+        <w:t xml:space="preserve">  --nsg-name my-vmNSG \</w:t>
       </w:r>
     </w:p>
     <w:p>
@@ -19515,50 +18738,7 @@
         <w:pStyle w:val="Code"/>
       </w:pPr>
       <w:r>
-        <w:t xml:space="preserve">  --query '[</w:t>
-      </w:r>
-      <w:proofErr w:type="gramStart"/>
-      <w:r>
-        <w:t>].{</w:t>
-      </w:r>
-      <w:proofErr w:type="spellStart"/>
-      <w:proofErr w:type="gramEnd"/>
-      <w:r>
-        <w:t>Name:name</w:t>
-      </w:r>
-      <w:proofErr w:type="spellEnd"/>
-      <w:r>
-        <w:t xml:space="preserve">, </w:t>
-      </w:r>
-      <w:proofErr w:type="spellStart"/>
-      <w:proofErr w:type="gramStart"/>
-      <w:r>
-        <w:t>Priority:priority</w:t>
-      </w:r>
-      <w:proofErr w:type="spellEnd"/>
-      <w:proofErr w:type="gramEnd"/>
-      <w:r>
-        <w:t xml:space="preserve">, </w:t>
-      </w:r>
-      <w:proofErr w:type="spellStart"/>
-      <w:proofErr w:type="gramStart"/>
-      <w:r>
-        <w:t>Port:destinationPortRange</w:t>
-      </w:r>
-      <w:proofErr w:type="spellEnd"/>
-      <w:proofErr w:type="gramEnd"/>
-      <w:r>
-        <w:t xml:space="preserve">, </w:t>
-      </w:r>
-      <w:proofErr w:type="spellStart"/>
-      <w:proofErr w:type="gramStart"/>
-      <w:r>
-        <w:t>Access:access</w:t>
-      </w:r>
-      <w:proofErr w:type="spellEnd"/>
-      <w:proofErr w:type="gramEnd"/>
-      <w:r>
-        <w:t>}' \</w:t>
+        <w:t xml:space="preserve">  --query '[].{Name:name, Priority:priority, Port:destinationPortRange, Access:access}' \</w:t>
       </w:r>
     </w:p>
     <w:p>
@@ -19612,6 +18792,7 @@
         <w:pStyle w:val="Tips"/>
       </w:pPr>
       <w:r>
+        <w:lastRenderedPageBreak/>
         <w:t>Output</w:t>
       </w:r>
     </w:p>
@@ -19636,15 +18817,7 @@
         <w:pStyle w:val="Code"/>
       </w:pPr>
       <w:r>
-        <w:t>default-allow-</w:t>
-      </w:r>
-      <w:proofErr w:type="gramStart"/>
-      <w:r>
-        <w:t>ssh  1000</w:t>
-      </w:r>
-      <w:proofErr w:type="gramEnd"/>
-      <w:r>
-        <w:t xml:space="preserve">        22      Allow</w:t>
+        <w:t>default-allow-ssh  1000        22      Allow</w:t>
       </w:r>
     </w:p>
     <w:p>
@@ -19747,20 +18920,7 @@
         <w:pStyle w:val="Code"/>
       </w:pPr>
       <w:r>
-        <w:t>&lt;html&gt;&lt;body&gt;&lt;h2&gt;Welcome to Azure! My name is my-</w:t>
-      </w:r>
-      <w:proofErr w:type="spellStart"/>
-      <w:proofErr w:type="gramStart"/>
-      <w:r>
-        <w:t>vm</w:t>
-      </w:r>
-      <w:proofErr w:type="spellEnd"/>
-      <w:r>
-        <w:t>.&lt;</w:t>
-      </w:r>
-      <w:proofErr w:type="gramEnd"/>
-      <w:r>
-        <w:t>/h2&gt;&lt;/body&gt;&lt;/html&gt;</w:t>
+        <w:t>&lt;html&gt;&lt;body&gt;&lt;h2&gt;Welcome to Azure! My name is my-vm.&lt;/h2&gt;&lt;/body&gt;&lt;/html&gt;</w:t>
       </w:r>
     </w:p>
     <w:p>
@@ -19893,6 +19053,7 @@
         <w:pStyle w:val="Heading4"/>
       </w:pPr>
       <w:r>
+        <w:lastRenderedPageBreak/>
         <w:t>Clean up</w:t>
       </w:r>
     </w:p>
@@ -19999,15 +19160,7 @@
     </w:p>
     <w:p>
       <w:r>
-        <w:t xml:space="preserve">When setting up a VPN gateway, you must specify the type of VPN - either policy-based or route-based. The primary distinction between these two types is how they determine which traffic needs encryption. In Azure, regardless of the VPN type, the method of authentication employed is a </w:t>
-      </w:r>
-      <w:proofErr w:type="spellStart"/>
-      <w:r>
-        <w:t>preshared</w:t>
-      </w:r>
-      <w:proofErr w:type="spellEnd"/>
-      <w:r>
-        <w:t xml:space="preserve"> key.</w:t>
+        <w:t>When setting up a VPN gateway, you must specify the type of VPN - either policy-based or route-based. The primary distinction between these two types is how they determine which traffic needs encryption. In Azure, regardless of the VPN type, the method of authentication employed is a preshared key.</w:t>
       </w:r>
     </w:p>
     <w:p>
@@ -20018,7 +19171,11 @@
         </w:numPr>
       </w:pPr>
       <w:r>
-        <w:t>Policy-based VPN gateways specify statically the IP address of packets that should be encrypted through each tunnel. This type of device evaluates every data packet against those sets of IP addresses to choose the tunnel where that packet is going to be sent through.</w:t>
+        <w:t xml:space="preserve">Policy-based VPN gateways specify statically the IP address of packets that should be encrypted through each tunnel. This type of device evaluates every data packet </w:t>
+      </w:r>
+      <w:r>
+        <w:lastRenderedPageBreak/>
+        <w:t>against those sets of IP addresses to choose the tunnel where that packet is going to be sent through.</w:t>
       </w:r>
     </w:p>
     <w:p>
@@ -20130,7 +19287,11 @@
     </w:p>
     <w:p>
       <w:r>
-        <w:t>Another high-availability option is to configure a VPN gateway as a secure failover path for ExpressRoute connections. ExpressRoute circuits have resiliency built in. However, they aren't immune to physical problems that affect the cables delivering connectivity or outages that affect the complete ExpressRoute location. In high-availability scenarios, where there's risk associated with an outage of an ExpressRoute circuit, you can also provision a VPN gateway that uses the internet as an alternative method of connectivity. In this way, you can ensure there's always a connection to the virtual networks.</w:t>
+        <w:t xml:space="preserve">Another high-availability option is to configure a VPN gateway as a secure failover path for ExpressRoute connections. ExpressRoute circuits have resiliency built in. However, they </w:t>
+      </w:r>
+      <w:r>
+        <w:lastRenderedPageBreak/>
+        <w:t>aren't immune to physical problems that affect the cables delivering connectivity or outages that affect the complete ExpressRoute location. In high-availability scenarios, where there's risk associated with an outage of an ExpressRoute circuit, you can also provision a VPN gateway that uses the internet as an alternative method of connectivity. In this way, you can ensure there's always a connection to the virtual networks.</w:t>
       </w:r>
     </w:p>
     <w:p>
@@ -29422,6 +28583,7 @@
   <w:style w:type="character" w:default="1" w:styleId="DefaultParagraphFont">
     <w:name w:val="Default Paragraph Font"/>
     <w:uiPriority w:val="1"/>
+    <w:semiHidden/>
     <w:unhideWhenUsed/>
   </w:style>
   <w:style w:type="table" w:default="1" w:styleId="TableNormal">

</xml_diff>